<commit_message>
S2 réaligné sur la matière Jacky enrichie (12 questions + labels niveaux) — salve C2
Le docx Jacky du repo était périmé : la version du 16 sept contient la
section « ÉVALUATION DE DÉPART » (12 questions + 5 niveaux). Questions
et labels intégrés verbatim, verrouillés par tests ; messages de
diagnostic = drafts Claude conservés. Q5/Q6 inversées, Q7 codée directe
(sens à trancher Jacky). Brief S2 + arbitrages mis à jour, R9-15 → doing.

Co-Authored-By: Claude Fable 5 <noreply@anthropic.com>
</commit_message>
<xml_diff>
--- a/docs/matiere-jacky/V0_PILIER 2 — ACTIVITÉ PHYSIQUE.docx
+++ b/docs/matiere-jacky/V0_PILIER 2 — ACTIVITÉ PHYSIQUE.docx
@@ -458,6 +458,26 @@
     </w:p>
     <w:p>
       <w:pPr>
+        <w:rPr/>
+      </w:pPr>
+      <w:r>
+        <w:rPr>
+          <w:rtl w:val="0"/>
+        </w:rPr>
+      </w:r>
+    </w:p>
+    <w:p>
+      <w:pPr>
+        <w:rPr/>
+      </w:pPr>
+      <w:r>
+        <w:rPr>
+          <w:rtl w:val="0"/>
+        </w:rPr>
+      </w:r>
+    </w:p>
+    <w:p>
+      <w:pPr>
         <w:pStyle w:val="Heading1"/>
         <w:keepNext w:val="0"/>
         <w:keepLines w:val="0"/>
@@ -469,7 +489,7 @@
           <w:szCs w:val="46"/>
         </w:rPr>
       </w:pPr>
-      <w:bookmarkStart w:colFirst="0" w:colLast="0" w:name="_rd3xj4mdpwpd" w:id="6"/>
+      <w:bookmarkStart w:colFirst="0" w:colLast="0" w:name="_qlcbhpak9uca" w:id="6"/>
       <w:bookmarkEnd w:id="6"/>
       <w:r>
         <w:rPr>
@@ -479,22 +499,7 @@
           <w:szCs w:val="46"/>
           <w:rtl w:val="0"/>
         </w:rPr>
-        <w:t xml:space="preserve">🟠 1. STRUCTURE D’UNE SÉANCE (STANDARD APP)</w:t>
-      </w:r>
-    </w:p>
-    <w:p>
-      <w:pPr>
-        <w:rPr/>
-      </w:pPr>
-      <w:r>
-        <w:pict>
-          <v:rect style="width:0.0pt;height:1.5pt" o:hr="t" o:hrstd="t" o:hralign="center" fillcolor="#A0A0A0" stroked="f"/>
-        </w:pict>
-      </w:r>
-      <w:r>
-        <w:rPr>
-          <w:rtl w:val="0"/>
-        </w:rPr>
+        <w:t xml:space="preserve">ÉVALUATION DE DÉPART — CONDITION PHYSIQUE</w:t>
       </w:r>
     </w:p>
     <w:p>
@@ -510,8 +515,529 @@
           <w:szCs w:val="34"/>
         </w:rPr>
       </w:pPr>
-      <w:bookmarkStart w:colFirst="0" w:colLast="0" w:name="_byznfrp7srmu" w:id="7"/>
+      <w:bookmarkStart w:colFirst="0" w:colLast="0" w:name="_n9ot8lppc67t" w:id="7"/>
       <w:bookmarkEnd w:id="7"/>
+      <w:r>
+        <w:rPr>
+          <w:b w:val="1"/>
+          <w:bCs w:val="1"/>
+          <w:sz w:val="34"/>
+          <w:szCs w:val="34"/>
+          <w:rtl w:val="0"/>
+        </w:rPr>
+        <w:t xml:space="preserve">Format</w:t>
+      </w:r>
+    </w:p>
+    <w:p>
+      <w:pPr>
+        <w:spacing w:after="240" w:before="240" w:lineRule="auto"/>
+        <w:rPr/>
+      </w:pPr>
+      <w:r>
+        <w:rPr>
+          <w:rtl w:val="0"/>
+        </w:rPr>
+        <w:t xml:space="preserve">12 questions</w:t>
+        <w:br w:type="textWrapping"/>
+        <w:t xml:space="preserve">Réponse de 1 à 5</w:t>
+      </w:r>
+    </w:p>
+    <w:p>
+      <w:pPr>
+        <w:spacing w:after="240" w:before="240" w:lineRule="auto"/>
+        <w:rPr/>
+      </w:pPr>
+      <w:r>
+        <w:rPr>
+          <w:rtl w:val="0"/>
+        </w:rPr>
+        <w:t xml:space="preserve">1 = jamais / très loin de moi</w:t>
+        <w:br w:type="textWrapping"/>
+        <w:t xml:space="preserve">5 = toujours / très proche de moi</w:t>
+      </w:r>
+    </w:p>
+    <w:p>
+      <w:pPr>
+        <w:rPr/>
+      </w:pPr>
+      <w:r>
+        <w:pict>
+          <v:rect style="width:0.0pt;height:1.5pt" o:hr="t" o:hrstd="t" o:hralign="center" fillcolor="#A0A0A0" stroked="f"/>
+        </w:pict>
+      </w:r>
+      <w:r>
+        <w:rPr>
+          <w:rtl w:val="0"/>
+        </w:rPr>
+      </w:r>
+    </w:p>
+    <w:p>
+      <w:pPr>
+        <w:pStyle w:val="Heading2"/>
+        <w:keepNext w:val="0"/>
+        <w:keepLines w:val="0"/>
+        <w:spacing w:after="80" w:lineRule="auto"/>
+        <w:rPr>
+          <w:b w:val="1"/>
+          <w:bCs w:val="1"/>
+          <w:sz w:val="34"/>
+          <w:szCs w:val="34"/>
+        </w:rPr>
+      </w:pPr>
+      <w:bookmarkStart w:colFirst="0" w:colLast="0" w:name="_r2etumfs5llj" w:id="8"/>
+      <w:bookmarkEnd w:id="8"/>
+      <w:r>
+        <w:rPr>
+          <w:b w:val="1"/>
+          <w:bCs w:val="1"/>
+          <w:sz w:val="34"/>
+          <w:szCs w:val="34"/>
+          <w:rtl w:val="0"/>
+        </w:rPr>
+        <w:t xml:space="preserve">Questions</w:t>
+      </w:r>
+    </w:p>
+    <w:p>
+      <w:pPr>
+        <w:spacing w:after="240" w:before="240" w:lineRule="auto"/>
+        <w:rPr/>
+      </w:pPr>
+      <w:r>
+        <w:rPr>
+          <w:rtl w:val="0"/>
+        </w:rPr>
+        <w:t xml:space="preserve">Je bouge physiquement presque tous les jours.</w:t>
+      </w:r>
+    </w:p>
+    <w:p>
+      <w:pPr>
+        <w:spacing w:after="240" w:before="240" w:lineRule="auto"/>
+        <w:rPr/>
+      </w:pPr>
+      <w:r>
+        <w:rPr>
+          <w:rtl w:val="0"/>
+        </w:rPr>
+        <w:t xml:space="preserve">Je me sens en forme physiquement dans ma journée.</w:t>
+      </w:r>
+    </w:p>
+    <w:p>
+      <w:pPr>
+        <w:spacing w:after="240" w:before="240" w:lineRule="auto"/>
+        <w:rPr/>
+      </w:pPr>
+      <w:r>
+        <w:rPr>
+          <w:rtl w:val="0"/>
+        </w:rPr>
+        <w:t xml:space="preserve">J’ai de l’énergie pour marcher, monter des escaliers ou porter des charges.</w:t>
+      </w:r>
+    </w:p>
+    <w:p>
+      <w:pPr>
+        <w:spacing w:after="240" w:before="240" w:lineRule="auto"/>
+        <w:rPr/>
+      </w:pPr>
+      <w:r>
+        <w:rPr>
+          <w:rtl w:val="0"/>
+        </w:rPr>
+        <w:t xml:space="preserve">Mon corps récupère bien après un effort.</w:t>
+      </w:r>
+    </w:p>
+    <w:p>
+      <w:pPr>
+        <w:spacing w:after="240" w:before="240" w:lineRule="auto"/>
+        <w:rPr/>
+      </w:pPr>
+      <w:r>
+        <w:rPr>
+          <w:rtl w:val="0"/>
+        </w:rPr>
+        <w:t xml:space="preserve">Je me sens souvent raide ou bloqué physiquement.</w:t>
+      </w:r>
+    </w:p>
+    <w:p>
+      <w:pPr>
+        <w:spacing w:after="240" w:before="240" w:lineRule="auto"/>
+        <w:rPr/>
+      </w:pPr>
+      <w:r>
+        <w:rPr>
+          <w:rtl w:val="0"/>
+        </w:rPr>
+        <w:t xml:space="preserve">Je manque régulièrement d’énergie pour faire du sport ou bouger.</w:t>
+      </w:r>
+    </w:p>
+    <w:p>
+      <w:pPr>
+        <w:spacing w:after="240" w:before="240" w:lineRule="auto"/>
+        <w:rPr/>
+      </w:pPr>
+      <w:r>
+        <w:rPr>
+          <w:rtl w:val="0"/>
+        </w:rPr>
+        <w:t xml:space="preserve">Je transpire facilement quand je fais un effort.</w:t>
+      </w:r>
+    </w:p>
+    <w:p>
+      <w:pPr>
+        <w:spacing w:after="240" w:before="240" w:lineRule="auto"/>
+        <w:rPr/>
+      </w:pPr>
+      <w:r>
+        <w:rPr>
+          <w:rtl w:val="0"/>
+        </w:rPr>
+        <w:t xml:space="preserve">Je sens que mon souffle est bon quand je marche ou cours.</w:t>
+      </w:r>
+    </w:p>
+    <w:p>
+      <w:pPr>
+        <w:spacing w:after="240" w:before="240" w:lineRule="auto"/>
+        <w:rPr/>
+      </w:pPr>
+      <w:r>
+        <w:rPr>
+          <w:rtl w:val="0"/>
+        </w:rPr>
+        <w:t xml:space="preserve">Je me sens solide physiquement.</w:t>
+      </w:r>
+    </w:p>
+    <w:p>
+      <w:pPr>
+        <w:spacing w:after="240" w:before="240" w:lineRule="auto"/>
+        <w:rPr/>
+      </w:pPr>
+      <w:r>
+        <w:rPr>
+          <w:rtl w:val="0"/>
+        </w:rPr>
+        <w:t xml:space="preserve">Je prends plaisir à bouger mon corps.</w:t>
+      </w:r>
+    </w:p>
+    <w:p>
+      <w:pPr>
+        <w:spacing w:after="240" w:before="240" w:lineRule="auto"/>
+        <w:rPr/>
+      </w:pPr>
+      <w:r>
+        <w:rPr>
+          <w:rtl w:val="0"/>
+        </w:rPr>
+        <w:t xml:space="preserve">J’ai l’impression que mon corps devient plus fort ou plus endurant.</w:t>
+      </w:r>
+    </w:p>
+    <w:p>
+      <w:pPr>
+        <w:spacing w:after="240" w:before="240" w:lineRule="auto"/>
+        <w:rPr/>
+      </w:pPr>
+      <w:r>
+        <w:rPr>
+          <w:rtl w:val="0"/>
+        </w:rPr>
+        <w:t xml:space="preserve">Je me sens vivant et dynamique physiquement.</w:t>
+      </w:r>
+    </w:p>
+    <w:p>
+      <w:pPr>
+        <w:rPr/>
+      </w:pPr>
+      <w:r>
+        <w:pict>
+          <v:rect style="width:0.0pt;height:1.5pt" o:hr="t" o:hrstd="t" o:hralign="center" fillcolor="#A0A0A0" stroked="f"/>
+        </w:pict>
+      </w:r>
+      <w:r>
+        <w:rPr>
+          <w:rtl w:val="0"/>
+        </w:rPr>
+      </w:r>
+    </w:p>
+    <w:p>
+      <w:pPr>
+        <w:pStyle w:val="Heading1"/>
+        <w:keepNext w:val="0"/>
+        <w:keepLines w:val="0"/>
+        <w:spacing w:before="480" w:lineRule="auto"/>
+        <w:rPr>
+          <w:b w:val="1"/>
+          <w:bCs w:val="1"/>
+          <w:sz w:val="46"/>
+          <w:szCs w:val="46"/>
+        </w:rPr>
+      </w:pPr>
+      <w:bookmarkStart w:colFirst="0" w:colLast="0" w:name="_f8e17o1fb23o" w:id="9"/>
+      <w:bookmarkEnd w:id="9"/>
+      <w:r>
+        <w:rPr>
+          <w:b w:val="1"/>
+          <w:bCs w:val="1"/>
+          <w:sz w:val="46"/>
+          <w:szCs w:val="46"/>
+          <w:rtl w:val="0"/>
+        </w:rPr>
+        <w:t xml:space="preserve">📊 NIVEAUX</w:t>
+      </w:r>
+    </w:p>
+    <w:p>
+      <w:pPr>
+        <w:pStyle w:val="Heading2"/>
+        <w:keepNext w:val="0"/>
+        <w:keepLines w:val="0"/>
+        <w:spacing w:after="80" w:lineRule="auto"/>
+        <w:rPr>
+          <w:b w:val="1"/>
+          <w:bCs w:val="1"/>
+          <w:sz w:val="34"/>
+          <w:szCs w:val="34"/>
+        </w:rPr>
+      </w:pPr>
+      <w:bookmarkStart w:colFirst="0" w:colLast="0" w:name="_nztvpcny0lge" w:id="10"/>
+      <w:bookmarkEnd w:id="10"/>
+      <w:r>
+        <w:rPr>
+          <w:b w:val="1"/>
+          <w:bCs w:val="1"/>
+          <w:sz w:val="34"/>
+          <w:szCs w:val="34"/>
+          <w:rtl w:val="0"/>
+        </w:rPr>
+        <w:t xml:space="preserve">🔴 Très faible — corps déconditionné</w:t>
+      </w:r>
+    </w:p>
+    <w:p>
+      <w:pPr>
+        <w:spacing w:after="240" w:before="240" w:lineRule="auto"/>
+        <w:rPr/>
+      </w:pPr>
+      <w:r>
+        <w:rPr>
+          <w:rtl w:val="0"/>
+        </w:rPr>
+        <w:t xml:space="preserve">Le corps manque de mouvement, d’endurance et d’énergie physique.</w:t>
+      </w:r>
+    </w:p>
+    <w:p>
+      <w:pPr>
+        <w:pStyle w:val="Heading2"/>
+        <w:keepNext w:val="0"/>
+        <w:keepLines w:val="0"/>
+        <w:spacing w:after="80" w:lineRule="auto"/>
+        <w:rPr>
+          <w:b w:val="1"/>
+          <w:bCs w:val="1"/>
+          <w:sz w:val="34"/>
+          <w:szCs w:val="34"/>
+        </w:rPr>
+      </w:pPr>
+      <w:bookmarkStart w:colFirst="0" w:colLast="0" w:name="_658114nf4gwg" w:id="11"/>
+      <w:bookmarkEnd w:id="11"/>
+      <w:r>
+        <w:rPr>
+          <w:b w:val="1"/>
+          <w:bCs w:val="1"/>
+          <w:sz w:val="34"/>
+          <w:szCs w:val="34"/>
+          <w:rtl w:val="0"/>
+        </w:rPr>
+        <w:t xml:space="preserve">🟠 Faible — remise en mouvement nécessaire</w:t>
+      </w:r>
+    </w:p>
+    <w:p>
+      <w:pPr>
+        <w:spacing w:after="240" w:before="240" w:lineRule="auto"/>
+        <w:rPr/>
+      </w:pPr>
+      <w:r>
+        <w:rPr>
+          <w:rtl w:val="0"/>
+        </w:rPr>
+        <w:t xml:space="preserve">Le corps bouge encore, mais avec fatigue, raideur ou irrégularité.</w:t>
+      </w:r>
+    </w:p>
+    <w:p>
+      <w:pPr>
+        <w:pStyle w:val="Heading2"/>
+        <w:keepNext w:val="0"/>
+        <w:keepLines w:val="0"/>
+        <w:spacing w:after="80" w:lineRule="auto"/>
+        <w:rPr>
+          <w:b w:val="1"/>
+          <w:bCs w:val="1"/>
+          <w:sz w:val="34"/>
+          <w:szCs w:val="34"/>
+        </w:rPr>
+      </w:pPr>
+      <w:bookmarkStart w:colFirst="0" w:colLast="0" w:name="_85e28vo36fc1" w:id="12"/>
+      <w:bookmarkEnd w:id="12"/>
+      <w:r>
+        <w:rPr>
+          <w:b w:val="1"/>
+          <w:bCs w:val="1"/>
+          <w:sz w:val="34"/>
+          <w:szCs w:val="34"/>
+          <w:rtl w:val="0"/>
+        </w:rPr>
+        <w:t xml:space="preserve">🟡 Moyen — base physique présente</w:t>
+      </w:r>
+    </w:p>
+    <w:p>
+      <w:pPr>
+        <w:spacing w:after="240" w:before="240" w:lineRule="auto"/>
+        <w:rPr/>
+      </w:pPr>
+      <w:r>
+        <w:rPr>
+          <w:rtl w:val="0"/>
+        </w:rPr>
+        <w:t xml:space="preserve">Certaines capacités sont là, mais le mouvement reste instable ou insuffisant.</w:t>
+      </w:r>
+    </w:p>
+    <w:p>
+      <w:pPr>
+        <w:pStyle w:val="Heading2"/>
+        <w:keepNext w:val="0"/>
+        <w:keepLines w:val="0"/>
+        <w:spacing w:after="80" w:lineRule="auto"/>
+        <w:rPr>
+          <w:b w:val="1"/>
+          <w:bCs w:val="1"/>
+          <w:sz w:val="34"/>
+          <w:szCs w:val="34"/>
+        </w:rPr>
+      </w:pPr>
+      <w:bookmarkStart w:colFirst="0" w:colLast="0" w:name="_8t65ia9lpub4" w:id="13"/>
+      <w:bookmarkEnd w:id="13"/>
+      <w:r>
+        <w:rPr>
+          <w:b w:val="1"/>
+          <w:bCs w:val="1"/>
+          <w:sz w:val="34"/>
+          <w:szCs w:val="34"/>
+          <w:rtl w:val="0"/>
+        </w:rPr>
+        <w:t xml:space="preserve">🟢 Bon — condition physique fonctionnelle</w:t>
+      </w:r>
+    </w:p>
+    <w:p>
+      <w:pPr>
+        <w:spacing w:after="240" w:before="240" w:lineRule="auto"/>
+        <w:rPr/>
+      </w:pPr>
+      <w:r>
+        <w:rPr>
+          <w:rtl w:val="0"/>
+        </w:rPr>
+        <w:t xml:space="preserve">Le corps possède déjà une bonne base de mouvement, d’énergie et de récupération.</w:t>
+      </w:r>
+    </w:p>
+    <w:p>
+      <w:pPr>
+        <w:pStyle w:val="Heading2"/>
+        <w:keepNext w:val="0"/>
+        <w:keepLines w:val="0"/>
+        <w:spacing w:after="80" w:lineRule="auto"/>
+        <w:rPr>
+          <w:b w:val="1"/>
+          <w:bCs w:val="1"/>
+          <w:sz w:val="34"/>
+          <w:szCs w:val="34"/>
+        </w:rPr>
+      </w:pPr>
+      <w:bookmarkStart w:colFirst="0" w:colLast="0" w:name="_k5hzzjrs2hwk" w:id="14"/>
+      <w:bookmarkEnd w:id="14"/>
+      <w:r>
+        <w:rPr>
+          <w:b w:val="1"/>
+          <w:bCs w:val="1"/>
+          <w:sz w:val="34"/>
+          <w:szCs w:val="34"/>
+          <w:rtl w:val="0"/>
+        </w:rPr>
+        <w:t xml:space="preserve">🟣 Optimal — corps dynamique et adaptable</w:t>
+      </w:r>
+    </w:p>
+    <w:p>
+      <w:pPr>
+        <w:spacing w:after="240" w:before="240" w:lineRule="auto"/>
+        <w:rPr/>
+      </w:pPr>
+      <w:r>
+        <w:rPr>
+          <w:rtl w:val="0"/>
+        </w:rPr>
+        <w:t xml:space="preserve">Le corps semble fort, mobile, endurant et capable de récupérer efficacement.</w:t>
+      </w:r>
+    </w:p>
+    <w:p>
+      <w:pPr>
+        <w:rPr/>
+      </w:pPr>
+      <w:r>
+        <w:rPr>
+          <w:rtl w:val="0"/>
+        </w:rPr>
+      </w:r>
+    </w:p>
+    <w:p>
+      <w:pPr>
+        <w:pStyle w:val="Heading1"/>
+        <w:keepNext w:val="0"/>
+        <w:keepLines w:val="0"/>
+        <w:spacing w:before="480" w:lineRule="auto"/>
+        <w:rPr>
+          <w:b w:val="1"/>
+          <w:bCs w:val="1"/>
+          <w:sz w:val="46"/>
+          <w:szCs w:val="46"/>
+        </w:rPr>
+      </w:pPr>
+      <w:bookmarkStart w:colFirst="0" w:colLast="0" w:name="_rd3xj4mdpwpd" w:id="15"/>
+      <w:bookmarkEnd w:id="15"/>
+      <w:r>
+        <w:rPr>
+          <w:b w:val="1"/>
+          <w:bCs w:val="1"/>
+          <w:sz w:val="46"/>
+          <w:szCs w:val="46"/>
+          <w:rtl w:val="0"/>
+        </w:rPr>
+        <w:t xml:space="preserve">🟠 1. STRUCTURE D’UNE SÉANCE (STANDARD APP)</w:t>
+      </w:r>
+    </w:p>
+    <w:p>
+      <w:pPr>
+        <w:rPr/>
+      </w:pPr>
+      <w:r>
+        <w:pict>
+          <v:rect style="width:0.0pt;height:1.5pt" o:hr="t" o:hrstd="t" o:hralign="center" fillcolor="#A0A0A0" stroked="f"/>
+        </w:pict>
+      </w:r>
+      <w:r>
+        <w:rPr>
+          <w:rtl w:val="0"/>
+        </w:rPr>
+      </w:r>
+    </w:p>
+    <w:p>
+      <w:pPr>
+        <w:pStyle w:val="Heading2"/>
+        <w:keepNext w:val="0"/>
+        <w:keepLines w:val="0"/>
+        <w:spacing w:after="80" w:lineRule="auto"/>
+        <w:rPr>
+          <w:b w:val="1"/>
+          <w:bCs w:val="1"/>
+          <w:sz w:val="34"/>
+          <w:szCs w:val="34"/>
+        </w:rPr>
+      </w:pPr>
+      <w:bookmarkStart w:colFirst="0" w:colLast="0" w:name="_byznfrp7srmu" w:id="16"/>
+      <w:bookmarkEnd w:id="16"/>
       <w:r>
         <w:rPr>
           <w:b w:val="1"/>
@@ -647,8 +1173,8 @@
           <w:szCs w:val="34"/>
         </w:rPr>
       </w:pPr>
-      <w:bookmarkStart w:colFirst="0" w:colLast="0" w:name="_c976huou4z4f" w:id="8"/>
-      <w:bookmarkEnd w:id="8"/>
+      <w:bookmarkStart w:colFirst="0" w:colLast="0" w:name="_c976huou4z4f" w:id="17"/>
+      <w:bookmarkEnd w:id="17"/>
       <w:r>
         <w:rPr>
           <w:rFonts w:ascii="Arial Unicode MS" w:cs="Arial Unicode MS" w:eastAsia="Arial Unicode MS" w:hAnsi="Arial Unicode MS"/>
@@ -754,8 +1280,8 @@
           <w:szCs w:val="46"/>
         </w:rPr>
       </w:pPr>
-      <w:bookmarkStart w:colFirst="0" w:colLast="0" w:name="_583xpsosvbcy" w:id="9"/>
-      <w:bookmarkEnd w:id="9"/>
+      <w:bookmarkStart w:colFirst="0" w:colLast="0" w:name="_583xpsosvbcy" w:id="18"/>
+      <w:bookmarkEnd w:id="18"/>
       <w:r>
         <w:rPr>
           <w:b w:val="1"/>
@@ -795,8 +1321,8 @@
           <w:szCs w:val="46"/>
         </w:rPr>
       </w:pPr>
-      <w:bookmarkStart w:colFirst="0" w:colLast="0" w:name="_y33x8k2pnii9" w:id="10"/>
-      <w:bookmarkEnd w:id="10"/>
+      <w:bookmarkStart w:colFirst="0" w:colLast="0" w:name="_y33x8k2pnii9" w:id="19"/>
+      <w:bookmarkEnd w:id="19"/>
       <w:r>
         <w:rPr>
           <w:b w:val="1"/>
@@ -836,8 +1362,8 @@
           <w:szCs w:val="34"/>
         </w:rPr>
       </w:pPr>
-      <w:bookmarkStart w:colFirst="0" w:colLast="0" w:name="_8tzmiq3lgc02" w:id="11"/>
-      <w:bookmarkEnd w:id="11"/>
+      <w:bookmarkStart w:colFirst="0" w:colLast="0" w:name="_8tzmiq3lgc02" w:id="20"/>
+      <w:bookmarkEnd w:id="20"/>
       <w:r>
         <w:rPr>
           <w:b w:val="1"/>
@@ -863,8 +1389,8 @@
           <w:szCs w:val="26"/>
         </w:rPr>
       </w:pPr>
-      <w:bookmarkStart w:colFirst="0" w:colLast="0" w:name="_lfnznse7ixy" w:id="12"/>
-      <w:bookmarkEnd w:id="12"/>
+      <w:bookmarkStart w:colFirst="0" w:colLast="0" w:name="_lfnznse7ixy" w:id="21"/>
+      <w:bookmarkEnd w:id="21"/>
       <w:r>
         <w:rPr>
           <w:b w:val="1"/>
@@ -903,8 +1429,8 @@
           <w:szCs w:val="26"/>
         </w:rPr>
       </w:pPr>
-      <w:bookmarkStart w:colFirst="0" w:colLast="0" w:name="_rvlwauukel08" w:id="13"/>
-      <w:bookmarkEnd w:id="13"/>
+      <w:bookmarkStart w:colFirst="0" w:colLast="0" w:name="_rvlwauukel08" w:id="22"/>
+      <w:bookmarkEnd w:id="22"/>
       <w:r>
         <w:rPr>
           <w:rFonts w:ascii="Arial Unicode MS" w:cs="Arial Unicode MS" w:eastAsia="Arial Unicode MS" w:hAnsi="Arial Unicode MS"/>
@@ -1013,8 +1539,8 @@
           <w:szCs w:val="34"/>
         </w:rPr>
       </w:pPr>
-      <w:bookmarkStart w:colFirst="0" w:colLast="0" w:name="_vb23j1ca7sx0" w:id="14"/>
-      <w:bookmarkEnd w:id="14"/>
+      <w:bookmarkStart w:colFirst="0" w:colLast="0" w:name="_vb23j1ca7sx0" w:id="23"/>
+      <w:bookmarkEnd w:id="23"/>
       <w:r>
         <w:rPr>
           <w:b w:val="1"/>
@@ -1040,8 +1566,8 @@
           <w:szCs w:val="26"/>
         </w:rPr>
       </w:pPr>
-      <w:bookmarkStart w:colFirst="0" w:colLast="0" w:name="_wam3pyckexm6" w:id="15"/>
-      <w:bookmarkEnd w:id="15"/>
+      <w:bookmarkStart w:colFirst="0" w:colLast="0" w:name="_wam3pyckexm6" w:id="24"/>
+      <w:bookmarkEnd w:id="24"/>
       <w:r>
         <w:rPr>
           <w:rFonts w:ascii="Arial Unicode MS" w:cs="Arial Unicode MS" w:eastAsia="Arial Unicode MS" w:hAnsi="Arial Unicode MS"/>
@@ -1136,8 +1662,8 @@
           <w:szCs w:val="34"/>
         </w:rPr>
       </w:pPr>
-      <w:bookmarkStart w:colFirst="0" w:colLast="0" w:name="_tgei727cv65t" w:id="16"/>
-      <w:bookmarkEnd w:id="16"/>
+      <w:bookmarkStart w:colFirst="0" w:colLast="0" w:name="_tgei727cv65t" w:id="25"/>
+      <w:bookmarkEnd w:id="25"/>
       <w:r>
         <w:rPr>
           <w:b w:val="1"/>
@@ -1163,8 +1689,8 @@
           <w:szCs w:val="26"/>
         </w:rPr>
       </w:pPr>
-      <w:bookmarkStart w:colFirst="0" w:colLast="0" w:name="_tpxciaz4hs01" w:id="17"/>
-      <w:bookmarkEnd w:id="17"/>
+      <w:bookmarkStart w:colFirst="0" w:colLast="0" w:name="_tpxciaz4hs01" w:id="26"/>
+      <w:bookmarkEnd w:id="26"/>
       <w:r>
         <w:rPr>
           <w:rFonts w:ascii="Arial Unicode MS" w:cs="Arial Unicode MS" w:eastAsia="Arial Unicode MS" w:hAnsi="Arial Unicode MS"/>
@@ -1259,8 +1785,8 @@
           <w:szCs w:val="34"/>
         </w:rPr>
       </w:pPr>
-      <w:bookmarkStart w:colFirst="0" w:colLast="0" w:name="_h1lre73fshh9" w:id="18"/>
-      <w:bookmarkEnd w:id="18"/>
+      <w:bookmarkStart w:colFirst="0" w:colLast="0" w:name="_h1lre73fshh9" w:id="27"/>
+      <w:bookmarkEnd w:id="27"/>
       <w:r>
         <w:rPr>
           <w:b w:val="1"/>
@@ -1322,8 +1848,8 @@
           <w:szCs w:val="46"/>
         </w:rPr>
       </w:pPr>
-      <w:bookmarkStart w:colFirst="0" w:colLast="0" w:name="_gmzhj9vck4tc" w:id="19"/>
-      <w:bookmarkEnd w:id="19"/>
+      <w:bookmarkStart w:colFirst="0" w:colLast="0" w:name="_gmzhj9vck4tc" w:id="28"/>
+      <w:bookmarkEnd w:id="28"/>
       <w:r>
         <w:rPr>
           <w:b w:val="1"/>
@@ -1363,8 +1889,8 @@
           <w:szCs w:val="34"/>
         </w:rPr>
       </w:pPr>
-      <w:bookmarkStart w:colFirst="0" w:colLast="0" w:name="_wx4hmnhwnn5b" w:id="20"/>
-      <w:bookmarkEnd w:id="20"/>
+      <w:bookmarkStart w:colFirst="0" w:colLast="0" w:name="_wx4hmnhwnn5b" w:id="29"/>
+      <w:bookmarkEnd w:id="29"/>
       <w:r>
         <w:rPr>
           <w:b w:val="1"/>
@@ -1390,8 +1916,8 @@
           <w:szCs w:val="26"/>
         </w:rPr>
       </w:pPr>
-      <w:bookmarkStart w:colFirst="0" w:colLast="0" w:name="_jh6sj4uphgb6" w:id="21"/>
-      <w:bookmarkEnd w:id="21"/>
+      <w:bookmarkStart w:colFirst="0" w:colLast="0" w:name="_jh6sj4uphgb6" w:id="30"/>
+      <w:bookmarkEnd w:id="30"/>
       <w:r>
         <w:rPr>
           <w:rFonts w:ascii="Arial Unicode MS" w:cs="Arial Unicode MS" w:eastAsia="Arial Unicode MS" w:hAnsi="Arial Unicode MS"/>
@@ -1525,8 +2051,8 @@
           <w:szCs w:val="34"/>
         </w:rPr>
       </w:pPr>
-      <w:bookmarkStart w:colFirst="0" w:colLast="0" w:name="_otcbs8pnwbz9" w:id="22"/>
-      <w:bookmarkEnd w:id="22"/>
+      <w:bookmarkStart w:colFirst="0" w:colLast="0" w:name="_otcbs8pnwbz9" w:id="31"/>
+      <w:bookmarkEnd w:id="31"/>
       <w:r>
         <w:rPr>
           <w:b w:val="1"/>
@@ -1552,8 +2078,8 @@
           <w:szCs w:val="26"/>
         </w:rPr>
       </w:pPr>
-      <w:bookmarkStart w:colFirst="0" w:colLast="0" w:name="_4yfqv088m705" w:id="23"/>
-      <w:bookmarkEnd w:id="23"/>
+      <w:bookmarkStart w:colFirst="0" w:colLast="0" w:name="_4yfqv088m705" w:id="32"/>
+      <w:bookmarkEnd w:id="32"/>
       <w:r>
         <w:rPr>
           <w:rFonts w:ascii="Arial Unicode MS" w:cs="Arial Unicode MS" w:eastAsia="Arial Unicode MS" w:hAnsi="Arial Unicode MS"/>
@@ -1703,8 +2229,8 @@
           <w:szCs w:val="34"/>
         </w:rPr>
       </w:pPr>
-      <w:bookmarkStart w:colFirst="0" w:colLast="0" w:name="_3yf150obvk4m" w:id="24"/>
-      <w:bookmarkEnd w:id="24"/>
+      <w:bookmarkStart w:colFirst="0" w:colLast="0" w:name="_3yf150obvk4m" w:id="33"/>
+      <w:bookmarkEnd w:id="33"/>
       <w:r>
         <w:rPr>
           <w:b w:val="1"/>
@@ -1730,8 +2256,8 @@
           <w:szCs w:val="26"/>
         </w:rPr>
       </w:pPr>
-      <w:bookmarkStart w:colFirst="0" w:colLast="0" w:name="_16hvcb69w4q9" w:id="25"/>
-      <w:bookmarkEnd w:id="25"/>
+      <w:bookmarkStart w:colFirst="0" w:colLast="0" w:name="_16hvcb69w4q9" w:id="34"/>
+      <w:bookmarkEnd w:id="34"/>
       <w:r>
         <w:rPr>
           <w:rFonts w:ascii="Arial Unicode MS" w:cs="Arial Unicode MS" w:eastAsia="Arial Unicode MS" w:hAnsi="Arial Unicode MS"/>
@@ -1881,8 +2407,8 @@
           <w:szCs w:val="34"/>
         </w:rPr>
       </w:pPr>
-      <w:bookmarkStart w:colFirst="0" w:colLast="0" w:name="_ankwcovkbvk2" w:id="26"/>
-      <w:bookmarkEnd w:id="26"/>
+      <w:bookmarkStart w:colFirst="0" w:colLast="0" w:name="_ankwcovkbvk2" w:id="35"/>
+      <w:bookmarkEnd w:id="35"/>
       <w:r>
         <w:rPr>
           <w:b w:val="1"/>
@@ -1945,8 +2471,8 @@
           <w:szCs w:val="46"/>
         </w:rPr>
       </w:pPr>
-      <w:bookmarkStart w:colFirst="0" w:colLast="0" w:name="_yu8kian1frb5" w:id="27"/>
-      <w:bookmarkEnd w:id="27"/>
+      <w:bookmarkStart w:colFirst="0" w:colLast="0" w:name="_yu8kian1frb5" w:id="36"/>
+      <w:bookmarkEnd w:id="36"/>
       <w:r>
         <w:rPr>
           <w:b w:val="1"/>
@@ -1986,8 +2512,8 @@
           <w:szCs w:val="34"/>
         </w:rPr>
       </w:pPr>
-      <w:bookmarkStart w:colFirst="0" w:colLast="0" w:name="_5zxsi6amerr" w:id="28"/>
-      <w:bookmarkEnd w:id="28"/>
+      <w:bookmarkStart w:colFirst="0" w:colLast="0" w:name="_5zxsi6amerr" w:id="37"/>
+      <w:bookmarkEnd w:id="37"/>
       <w:r>
         <w:rPr>
           <w:b w:val="1"/>
@@ -2012,8 +2538,8 @@
           <w:szCs w:val="34"/>
         </w:rPr>
       </w:pPr>
-      <w:bookmarkStart w:colFirst="0" w:colLast="0" w:name="_t368234xti78" w:id="29"/>
-      <w:bookmarkEnd w:id="29"/>
+      <w:bookmarkStart w:colFirst="0" w:colLast="0" w:name="_t368234xti78" w:id="38"/>
+      <w:bookmarkEnd w:id="38"/>
       <w:r>
         <w:rPr>
           <w:b w:val="1"/>
@@ -2039,8 +2565,8 @@
           <w:szCs w:val="26"/>
         </w:rPr>
       </w:pPr>
-      <w:bookmarkStart w:colFirst="0" w:colLast="0" w:name="_y4o7jfo1xxu" w:id="30"/>
-      <w:bookmarkEnd w:id="30"/>
+      <w:bookmarkStart w:colFirst="0" w:colLast="0" w:name="_y4o7jfo1xxu" w:id="39"/>
+      <w:bookmarkEnd w:id="39"/>
       <w:r>
         <w:rPr>
           <w:rFonts w:ascii="Arial Unicode MS" w:cs="Arial Unicode MS" w:eastAsia="Arial Unicode MS" w:hAnsi="Arial Unicode MS"/>
@@ -2103,8 +2629,8 @@
           <w:szCs w:val="34"/>
         </w:rPr>
       </w:pPr>
-      <w:bookmarkStart w:colFirst="0" w:colLast="0" w:name="_mvdk8uo47nlt" w:id="31"/>
-      <w:bookmarkEnd w:id="31"/>
+      <w:bookmarkStart w:colFirst="0" w:colLast="0" w:name="_mvdk8uo47nlt" w:id="40"/>
+      <w:bookmarkEnd w:id="40"/>
       <w:r>
         <w:rPr>
           <w:b w:val="1"/>
@@ -2131,8 +2657,8 @@
           <w:szCs w:val="26"/>
         </w:rPr>
       </w:pPr>
-      <w:bookmarkStart w:colFirst="0" w:colLast="0" w:name="_ovdnp31qoexv" w:id="32"/>
-      <w:bookmarkEnd w:id="32"/>
+      <w:bookmarkStart w:colFirst="0" w:colLast="0" w:name="_ovdnp31qoexv" w:id="41"/>
+      <w:bookmarkEnd w:id="41"/>
       <w:r>
         <w:rPr>
           <w:rFonts w:ascii="Arial Unicode MS" w:cs="Arial Unicode MS" w:eastAsia="Arial Unicode MS" w:hAnsi="Arial Unicode MS"/>
@@ -2195,8 +2721,8 @@
           <w:szCs w:val="34"/>
         </w:rPr>
       </w:pPr>
-      <w:bookmarkStart w:colFirst="0" w:colLast="0" w:name="_k7xjjdkbkglu" w:id="33"/>
-      <w:bookmarkEnd w:id="33"/>
+      <w:bookmarkStart w:colFirst="0" w:colLast="0" w:name="_k7xjjdkbkglu" w:id="42"/>
+      <w:bookmarkEnd w:id="42"/>
       <w:r>
         <w:rPr>
           <w:b w:val="1"/>
@@ -2222,8 +2748,8 @@
           <w:szCs w:val="26"/>
         </w:rPr>
       </w:pPr>
-      <w:bookmarkStart w:colFirst="0" w:colLast="0" w:name="_4kyp96dptu41" w:id="34"/>
-      <w:bookmarkEnd w:id="34"/>
+      <w:bookmarkStart w:colFirst="0" w:colLast="0" w:name="_4kyp96dptu41" w:id="43"/>
+      <w:bookmarkEnd w:id="43"/>
       <w:r>
         <w:rPr>
           <w:rFonts w:ascii="Arial Unicode MS" w:cs="Arial Unicode MS" w:eastAsia="Arial Unicode MS" w:hAnsi="Arial Unicode MS"/>
@@ -2302,8 +2828,8 @@
           <w:szCs w:val="34"/>
         </w:rPr>
       </w:pPr>
-      <w:bookmarkStart w:colFirst="0" w:colLast="0" w:name="_qxzftvcmn4vv" w:id="35"/>
-      <w:bookmarkEnd w:id="35"/>
+      <w:bookmarkStart w:colFirst="0" w:colLast="0" w:name="_qxzftvcmn4vv" w:id="44"/>
+      <w:bookmarkEnd w:id="44"/>
       <w:r>
         <w:rPr>
           <w:b w:val="1"/>
@@ -2371,8 +2897,8 @@
           <w:szCs w:val="34"/>
         </w:rPr>
       </w:pPr>
-      <w:bookmarkStart w:colFirst="0" w:colLast="0" w:name="_uo6uwmd8d8tn" w:id="36"/>
-      <w:bookmarkEnd w:id="36"/>
+      <w:bookmarkStart w:colFirst="0" w:colLast="0" w:name="_uo6uwmd8d8tn" w:id="45"/>
+      <w:bookmarkEnd w:id="45"/>
       <w:r>
         <w:rPr>
           <w:b w:val="1"/>
@@ -2397,8 +2923,8 @@
           <w:szCs w:val="34"/>
         </w:rPr>
       </w:pPr>
-      <w:bookmarkStart w:colFirst="0" w:colLast="0" w:name="_dy4zd3wgmw56" w:id="37"/>
-      <w:bookmarkEnd w:id="37"/>
+      <w:bookmarkStart w:colFirst="0" w:colLast="0" w:name="_dy4zd3wgmw56" w:id="46"/>
+      <w:bookmarkEnd w:id="46"/>
       <w:r>
         <w:rPr>
           <w:b w:val="1"/>
@@ -2424,8 +2950,8 @@
           <w:szCs w:val="26"/>
         </w:rPr>
       </w:pPr>
-      <w:bookmarkStart w:colFirst="0" w:colLast="0" w:name="_ihcqu1o6zyup" w:id="38"/>
-      <w:bookmarkEnd w:id="38"/>
+      <w:bookmarkStart w:colFirst="0" w:colLast="0" w:name="_ihcqu1o6zyup" w:id="47"/>
+      <w:bookmarkEnd w:id="47"/>
       <w:r>
         <w:rPr>
           <w:rFonts w:ascii="Arial Unicode MS" w:cs="Arial Unicode MS" w:eastAsia="Arial Unicode MS" w:hAnsi="Arial Unicode MS"/>
@@ -2488,8 +3014,8 @@
           <w:szCs w:val="34"/>
         </w:rPr>
       </w:pPr>
-      <w:bookmarkStart w:colFirst="0" w:colLast="0" w:name="_3kg76d2xdq78" w:id="39"/>
-      <w:bookmarkEnd w:id="39"/>
+      <w:bookmarkStart w:colFirst="0" w:colLast="0" w:name="_3kg76d2xdq78" w:id="48"/>
+      <w:bookmarkEnd w:id="48"/>
       <w:r>
         <w:rPr>
           <w:b w:val="1"/>
@@ -2515,8 +3041,8 @@
           <w:szCs w:val="26"/>
         </w:rPr>
       </w:pPr>
-      <w:bookmarkStart w:colFirst="0" w:colLast="0" w:name="_mqndcppdwplf" w:id="40"/>
-      <w:bookmarkEnd w:id="40"/>
+      <w:bookmarkStart w:colFirst="0" w:colLast="0" w:name="_mqndcppdwplf" w:id="49"/>
+      <w:bookmarkEnd w:id="49"/>
       <w:r>
         <w:rPr>
           <w:rFonts w:ascii="Arial Unicode MS" w:cs="Arial Unicode MS" w:eastAsia="Arial Unicode MS" w:hAnsi="Arial Unicode MS"/>
@@ -2563,8 +3089,8 @@
         <w:spacing w:before="280" w:lineRule="auto"/>
         <w:rPr/>
       </w:pPr>
-      <w:bookmarkStart w:colFirst="0" w:colLast="0" w:name="_spsdg5d0pbsg" w:id="41"/>
-      <w:bookmarkEnd w:id="41"/>
+      <w:bookmarkStart w:colFirst="0" w:colLast="0" w:name="_spsdg5d0pbsg" w:id="50"/>
+      <w:bookmarkEnd w:id="50"/>
       <w:r>
         <w:pict>
           <v:rect style="width:0.0pt;height:1.5pt" o:hr="t" o:hrstd="t" o:hralign="center" fillcolor="#A0A0A0" stroked="f"/>
@@ -2589,8 +3115,8 @@
           <w:szCs w:val="34"/>
         </w:rPr>
       </w:pPr>
-      <w:bookmarkStart w:colFirst="0" w:colLast="0" w:name="_at14s2y5isoa" w:id="42"/>
-      <w:bookmarkEnd w:id="42"/>
+      <w:bookmarkStart w:colFirst="0" w:colLast="0" w:name="_at14s2y5isoa" w:id="51"/>
+      <w:bookmarkEnd w:id="51"/>
       <w:r>
         <w:rPr>
           <w:b w:val="1"/>
@@ -2616,8 +3142,8 @@
           <w:szCs w:val="26"/>
         </w:rPr>
       </w:pPr>
-      <w:bookmarkStart w:colFirst="0" w:colLast="0" w:name="_tebjqtsp831b" w:id="43"/>
-      <w:bookmarkEnd w:id="43"/>
+      <w:bookmarkStart w:colFirst="0" w:colLast="0" w:name="_tebjqtsp831b" w:id="52"/>
+      <w:bookmarkEnd w:id="52"/>
       <w:r>
         <w:rPr>
           <w:rFonts w:ascii="Arial Unicode MS" w:cs="Arial Unicode MS" w:eastAsia="Arial Unicode MS" w:hAnsi="Arial Unicode MS"/>
@@ -2695,8 +3221,8 @@
           <w:szCs w:val="34"/>
         </w:rPr>
       </w:pPr>
-      <w:bookmarkStart w:colFirst="0" w:colLast="0" w:name="_zc2prwckqjia" w:id="44"/>
-      <w:bookmarkEnd w:id="44"/>
+      <w:bookmarkStart w:colFirst="0" w:colLast="0" w:name="_zc2prwckqjia" w:id="53"/>
+      <w:bookmarkEnd w:id="53"/>
       <w:r>
         <w:rPr>
           <w:b w:val="1"/>
@@ -2764,8 +3290,8 @@
           <w:szCs w:val="46"/>
         </w:rPr>
       </w:pPr>
-      <w:bookmarkStart w:colFirst="0" w:colLast="0" w:name="_ywy3vj70yf3u" w:id="45"/>
-      <w:bookmarkEnd w:id="45"/>
+      <w:bookmarkStart w:colFirst="0" w:colLast="0" w:name="_ywy3vj70yf3u" w:id="54"/>
+      <w:bookmarkEnd w:id="54"/>
       <w:r>
         <w:rPr>
           <w:b w:val="1"/>
@@ -3379,8 +3905,8 @@
           <w:szCs w:val="34"/>
         </w:rPr>
       </w:pPr>
-      <w:bookmarkStart w:colFirst="0" w:colLast="0" w:name="_oq93w6mf3y4u" w:id="46"/>
-      <w:bookmarkEnd w:id="46"/>
+      <w:bookmarkStart w:colFirst="0" w:colLast="0" w:name="_oq93w6mf3y4u" w:id="55"/>
+      <w:bookmarkEnd w:id="55"/>
       <w:r>
         <w:rPr>
           <w:b w:val="1"/>
@@ -3442,8 +3968,8 @@
           <w:szCs w:val="46"/>
         </w:rPr>
       </w:pPr>
-      <w:bookmarkStart w:colFirst="0" w:colLast="0" w:name="_p2x4kcmego50" w:id="47"/>
-      <w:bookmarkEnd w:id="47"/>
+      <w:bookmarkStart w:colFirst="0" w:colLast="0" w:name="_p2x4kcmego50" w:id="56"/>
+      <w:bookmarkEnd w:id="56"/>
       <w:r>
         <w:rPr>
           <w:b w:val="1"/>
@@ -3483,8 +4009,8 @@
           <w:szCs w:val="34"/>
         </w:rPr>
       </w:pPr>
-      <w:bookmarkStart w:colFirst="0" w:colLast="0" w:name="_7kl0ymjblk80" w:id="48"/>
-      <w:bookmarkEnd w:id="48"/>
+      <w:bookmarkStart w:colFirst="0" w:colLast="0" w:name="_7kl0ymjblk80" w:id="57"/>
+      <w:bookmarkEnd w:id="57"/>
       <w:r>
         <w:rPr>
           <w:b w:val="1"/>
@@ -3588,8 +4114,8 @@
           <w:szCs w:val="34"/>
         </w:rPr>
       </w:pPr>
-      <w:bookmarkStart w:colFirst="0" w:colLast="0" w:name="_9pmjmvygfa3y" w:id="49"/>
-      <w:bookmarkEnd w:id="49"/>
+      <w:bookmarkStart w:colFirst="0" w:colLast="0" w:name="_9pmjmvygfa3y" w:id="58"/>
+      <w:bookmarkEnd w:id="58"/>
       <w:r>
         <w:rPr>
           <w:b w:val="1"/>
@@ -3682,8 +4208,8 @@
           <w:szCs w:val="46"/>
         </w:rPr>
       </w:pPr>
-      <w:bookmarkStart w:colFirst="0" w:colLast="0" w:name="_r1f4xdc2pttz" w:id="50"/>
-      <w:bookmarkEnd w:id="50"/>
+      <w:bookmarkStart w:colFirst="0" w:colLast="0" w:name="_r1f4xdc2pttz" w:id="59"/>
+      <w:bookmarkEnd w:id="59"/>
       <w:r>
         <w:rPr>
           <w:b w:val="1"/>
@@ -3723,8 +4249,8 @@
           <w:szCs w:val="34"/>
         </w:rPr>
       </w:pPr>
-      <w:bookmarkStart w:colFirst="0" w:colLast="0" w:name="_3evkl0y8897b" w:id="51"/>
-      <w:bookmarkEnd w:id="51"/>
+      <w:bookmarkStart w:colFirst="0" w:colLast="0" w:name="_3evkl0y8897b" w:id="60"/>
+      <w:bookmarkEnd w:id="60"/>
       <w:r>
         <w:rPr>
           <w:b w:val="1"/>
@@ -3817,8 +4343,8 @@
           <w:szCs w:val="46"/>
         </w:rPr>
       </w:pPr>
-      <w:bookmarkStart w:colFirst="0" w:colLast="0" w:name="_n6o259oj5b24" w:id="52"/>
-      <w:bookmarkEnd w:id="52"/>
+      <w:bookmarkStart w:colFirst="0" w:colLast="0" w:name="_n6o259oj5b24" w:id="61"/>
+      <w:bookmarkEnd w:id="61"/>
       <w:r>
         <w:rPr>
           <w:b w:val="1"/>
@@ -3858,8 +4384,8 @@
           <w:szCs w:val="34"/>
         </w:rPr>
       </w:pPr>
-      <w:bookmarkStart w:colFirst="0" w:colLast="0" w:name="_qn9zy8tzlsiq" w:id="53"/>
-      <w:bookmarkEnd w:id="53"/>
+      <w:bookmarkStart w:colFirst="0" w:colLast="0" w:name="_qn9zy8tzlsiq" w:id="62"/>
+      <w:bookmarkEnd w:id="62"/>
       <w:r>
         <w:rPr>
           <w:b w:val="1"/>
@@ -3911,8 +4437,8 @@
           <w:szCs w:val="34"/>
         </w:rPr>
       </w:pPr>
-      <w:bookmarkStart w:colFirst="0" w:colLast="0" w:name="_v6f9t7al95yw" w:id="54"/>
-      <w:bookmarkEnd w:id="54"/>
+      <w:bookmarkStart w:colFirst="0" w:colLast="0" w:name="_v6f9t7al95yw" w:id="63"/>
+      <w:bookmarkEnd w:id="63"/>
       <w:r>
         <w:rPr>
           <w:b w:val="1"/>
@@ -3969,8 +4495,8 @@
           <w:szCs w:val="46"/>
         </w:rPr>
       </w:pPr>
-      <w:bookmarkStart w:colFirst="0" w:colLast="0" w:name="_z6x5bhrrquw2" w:id="55"/>
-      <w:bookmarkEnd w:id="55"/>
+      <w:bookmarkStart w:colFirst="0" w:colLast="0" w:name="_z6x5bhrrquw2" w:id="64"/>
+      <w:bookmarkEnd w:id="64"/>
       <w:r>
         <w:rPr>
           <w:b w:val="1"/>
@@ -4132,8 +4658,8 @@
           <w:szCs w:val="46"/>
         </w:rPr>
       </w:pPr>
-      <w:bookmarkStart w:colFirst="0" w:colLast="0" w:name="_vb9br5u0ckzw" w:id="56"/>
-      <w:bookmarkEnd w:id="56"/>
+      <w:bookmarkStart w:colFirst="0" w:colLast="0" w:name="_vb9br5u0ckzw" w:id="65"/>
+      <w:bookmarkEnd w:id="65"/>
       <w:r>
         <w:rPr>
           <w:b w:val="1"/>
@@ -4173,8 +4699,8 @@
           <w:szCs w:val="34"/>
         </w:rPr>
       </w:pPr>
-      <w:bookmarkStart w:colFirst="0" w:colLast="0" w:name="_8gv7hsjq9z0r" w:id="57"/>
-      <w:bookmarkEnd w:id="57"/>
+      <w:bookmarkStart w:colFirst="0" w:colLast="0" w:name="_8gv7hsjq9z0r" w:id="66"/>
+      <w:bookmarkEnd w:id="66"/>
       <w:r>
         <w:rPr>
           <w:b w:val="1"/>
@@ -4278,8 +4804,8 @@
           <w:szCs w:val="34"/>
         </w:rPr>
       </w:pPr>
-      <w:bookmarkStart w:colFirst="0" w:colLast="0" w:name="_uopcz3qq4abo" w:id="58"/>
-      <w:bookmarkEnd w:id="58"/>
+      <w:bookmarkStart w:colFirst="0" w:colLast="0" w:name="_uopcz3qq4abo" w:id="67"/>
+      <w:bookmarkEnd w:id="67"/>
       <w:r>
         <w:rPr>
           <w:b w:val="1"/>
@@ -4341,8 +4867,8 @@
           <w:szCs w:val="46"/>
         </w:rPr>
       </w:pPr>
-      <w:bookmarkStart w:colFirst="0" w:colLast="0" w:name="_1asopgxmclhl" w:id="59"/>
-      <w:bookmarkEnd w:id="59"/>
+      <w:bookmarkStart w:colFirst="0" w:colLast="0" w:name="_1asopgxmclhl" w:id="68"/>
+      <w:bookmarkEnd w:id="68"/>
       <w:r>
         <w:rPr>
           <w:b w:val="1"/>
@@ -4426,8 +4952,8 @@
           <w:szCs w:val="46"/>
         </w:rPr>
       </w:pPr>
-      <w:bookmarkStart w:colFirst="0" w:colLast="0" w:name="_dsbs0t4vf25f" w:id="60"/>
-      <w:bookmarkEnd w:id="60"/>
+      <w:bookmarkStart w:colFirst="0" w:colLast="0" w:name="_dsbs0t4vf25f" w:id="69"/>
+      <w:bookmarkEnd w:id="69"/>
       <w:r>
         <w:rPr>
           <w:b w:val="1"/>
@@ -4467,8 +4993,8 @@
           <w:szCs w:val="34"/>
         </w:rPr>
       </w:pPr>
-      <w:bookmarkStart w:colFirst="0" w:colLast="0" w:name="_bx87ad8anyrm" w:id="61"/>
-      <w:bookmarkEnd w:id="61"/>
+      <w:bookmarkStart w:colFirst="0" w:colLast="0" w:name="_bx87ad8anyrm" w:id="70"/>
+      <w:bookmarkEnd w:id="70"/>
       <w:r>
         <w:rPr>
           <w:b w:val="1"/>
@@ -4522,8 +5048,8 @@
           <w:szCs w:val="34"/>
         </w:rPr>
       </w:pPr>
-      <w:bookmarkStart w:colFirst="0" w:colLast="0" w:name="_r1ub755xtouy" w:id="62"/>
-      <w:bookmarkEnd w:id="62"/>
+      <w:bookmarkStart w:colFirst="0" w:colLast="0" w:name="_r1ub755xtouy" w:id="71"/>
+      <w:bookmarkEnd w:id="71"/>
       <w:r>
         <w:rPr>
           <w:b w:val="1"/>
@@ -4575,8 +5101,8 @@
           <w:szCs w:val="34"/>
         </w:rPr>
       </w:pPr>
-      <w:bookmarkStart w:colFirst="0" w:colLast="0" w:name="_49jcwp7vwvcf" w:id="63"/>
-      <w:bookmarkEnd w:id="63"/>
+      <w:bookmarkStart w:colFirst="0" w:colLast="0" w:name="_49jcwp7vwvcf" w:id="72"/>
+      <w:bookmarkEnd w:id="72"/>
       <w:r>
         <w:rPr>
           <w:b w:val="1"/>
@@ -4628,8 +5154,8 @@
           <w:szCs w:val="34"/>
         </w:rPr>
       </w:pPr>
-      <w:bookmarkStart w:colFirst="0" w:colLast="0" w:name="_siu61h49mi72" w:id="64"/>
-      <w:bookmarkEnd w:id="64"/>
+      <w:bookmarkStart w:colFirst="0" w:colLast="0" w:name="_siu61h49mi72" w:id="73"/>
+      <w:bookmarkEnd w:id="73"/>
       <w:r>
         <w:rPr>
           <w:b w:val="1"/>
@@ -4686,8 +5212,8 @@
           <w:szCs w:val="46"/>
         </w:rPr>
       </w:pPr>
-      <w:bookmarkStart w:colFirst="0" w:colLast="0" w:name="_fzo31ri1gs15" w:id="65"/>
-      <w:bookmarkEnd w:id="65"/>
+      <w:bookmarkStart w:colFirst="0" w:colLast="0" w:name="_fzo31ri1gs15" w:id="74"/>
+      <w:bookmarkEnd w:id="74"/>
       <w:r>
         <w:rPr>
           <w:b w:val="1"/>
@@ -4893,8 +5419,8 @@
           <w:szCs w:val="34"/>
         </w:rPr>
       </w:pPr>
-      <w:bookmarkStart w:colFirst="0" w:colLast="0" w:name="_m0eezm2rtya7" w:id="66"/>
-      <w:bookmarkEnd w:id="66"/>
+      <w:bookmarkStart w:colFirst="0" w:colLast="0" w:name="_m0eezm2rtya7" w:id="75"/>
+      <w:bookmarkEnd w:id="75"/>
       <w:r>
         <w:rPr>
           <w:b w:val="1"/>
@@ -4952,8 +5478,8 @@
           <w:szCs w:val="46"/>
         </w:rPr>
       </w:pPr>
-      <w:bookmarkStart w:colFirst="0" w:colLast="0" w:name="_po2vh7fenqr6" w:id="67"/>
-      <w:bookmarkEnd w:id="67"/>
+      <w:bookmarkStart w:colFirst="0" w:colLast="0" w:name="_po2vh7fenqr6" w:id="76"/>
+      <w:bookmarkEnd w:id="76"/>
       <w:r>
         <w:rPr>
           <w:b w:val="1"/>
@@ -4993,8 +5519,8 @@
           <w:szCs w:val="34"/>
         </w:rPr>
       </w:pPr>
-      <w:bookmarkStart w:colFirst="0" w:colLast="0" w:name="_xzs7j8wgx0be" w:id="68"/>
-      <w:bookmarkEnd w:id="68"/>
+      <w:bookmarkStart w:colFirst="0" w:colLast="0" w:name="_xzs7j8wgx0be" w:id="77"/>
+      <w:bookmarkEnd w:id="77"/>
       <w:r>
         <w:rPr>
           <w:b w:val="1"/>
@@ -5050,8 +5576,8 @@
           <w:szCs w:val="34"/>
         </w:rPr>
       </w:pPr>
-      <w:bookmarkStart w:colFirst="0" w:colLast="0" w:name="_t7q4817inc5j" w:id="69"/>
-      <w:bookmarkEnd w:id="69"/>
+      <w:bookmarkStart w:colFirst="0" w:colLast="0" w:name="_t7q4817inc5j" w:id="78"/>
+      <w:bookmarkEnd w:id="78"/>
       <w:r>
         <w:rPr>
           <w:rFonts w:ascii="Arial Unicode MS" w:cs="Arial Unicode MS" w:eastAsia="Arial Unicode MS" w:hAnsi="Arial Unicode MS"/>
@@ -5124,8 +5650,8 @@
           <w:szCs w:val="34"/>
         </w:rPr>
       </w:pPr>
-      <w:bookmarkStart w:colFirst="0" w:colLast="0" w:name="_o3exu2h5k8kf" w:id="70"/>
-      <w:bookmarkEnd w:id="70"/>
+      <w:bookmarkStart w:colFirst="0" w:colLast="0" w:name="_o3exu2h5k8kf" w:id="79"/>
+      <w:bookmarkEnd w:id="79"/>
       <w:r>
         <w:rPr>
           <w:b w:val="1"/>
@@ -5181,8 +5707,8 @@
           <w:szCs w:val="34"/>
         </w:rPr>
       </w:pPr>
-      <w:bookmarkStart w:colFirst="0" w:colLast="0" w:name="_fxilmeq5fsk0" w:id="71"/>
-      <w:bookmarkEnd w:id="71"/>
+      <w:bookmarkStart w:colFirst="0" w:colLast="0" w:name="_fxilmeq5fsk0" w:id="80"/>
+      <w:bookmarkEnd w:id="80"/>
       <w:r>
         <w:rPr>
           <w:rFonts w:ascii="Arial Unicode MS" w:cs="Arial Unicode MS" w:eastAsia="Arial Unicode MS" w:hAnsi="Arial Unicode MS"/>
@@ -5260,8 +5786,8 @@
           <w:szCs w:val="46"/>
         </w:rPr>
       </w:pPr>
-      <w:bookmarkStart w:colFirst="0" w:colLast="0" w:name="_id01h2ca3p7g" w:id="72"/>
-      <w:bookmarkEnd w:id="72"/>
+      <w:bookmarkStart w:colFirst="0" w:colLast="0" w:name="_id01h2ca3p7g" w:id="81"/>
+      <w:bookmarkEnd w:id="81"/>
       <w:r>
         <w:rPr>
           <w:b w:val="1"/>

</xml_diff>